<commit_message>
Trim the English abstract to the 250-word limit and set the title to 11 pt Arial
Co-Authored-By: Claude Opus 5 <noreply@anthropic.com>
</commit_message>
<xml_diff>
--- a/submission/Abstract_Puttitada_Pruetchayakul.docx
+++ b/submission/Abstract_Puttitada_Pruetchayakul.docx
@@ -292,9 +292,9 @@
           <w:rFonts w:ascii="Arial" w:hAnsi="Arial" w:cs="Arial" w:eastAsia="Arial"/>
           <w:b/>
           <w:i w:val="0"/>
-          <w:sz w:val="24"/>
-          <w:u w:val="none"/>
-          <w:szCs w:val="24"/>
+          <w:sz w:val="22"/>
+          <w:u w:val="none"/>
+          <w:szCs w:val="22"/>
         </w:rPr>
         <w:t>DOCKING-BASED PRIORITISATION OF RICEBERRY BRAN CONSTITUENTS AGAINST HUMAN α-GLUCOSIDASE AND α-AMYLASE FOR BY-PRODUCT VALORISATION</w:t>
       </w:r>
@@ -388,7 +388,7 @@
           <w:u w:val="none"/>
           <w:szCs w:val="22"/>
         </w:rPr>
-        <w:t>Riceberry bran, a low-value by-product of Thai rice milling, contains anthocyanins, γ-oryzanol, vitamin E and phenolic acids. Anthocyanins from pigmented rice inhibit the starch-digesting enzymes α-glucosidase and α-amylase in vitro. Which constituent to extract and assay first is unresolved, as they have never been compared on the human enzymes.</w:t>
+        <w:t>Riceberry bran, a low-value by-product of Thai rice milling, contains anthocyanins, γ-oryzanol, vitamin E and phenolic acids. Anthocyanins from pigmented rice inhibit the starch-digesting enzymes α-glucosidase and α-amylase in vitro. Which to extract and assay first is unresolved: they have never been compared on the human enzymes.</w:t>
       </w:r>
       <w:r>
         <w:rPr>
@@ -410,7 +410,7 @@
           <w:u w:val="none"/>
           <w:szCs w:val="22"/>
         </w:rPr>
-        <w:t>To prioritise eleven reported Riceberry bran constituents by predicted binding to human maltase-glucoamylase (MGAM) and pancreatic α-amylase (HPA), alongside the solubility a food ingredient needs.</w:t>
+        <w:t>To prioritise eleven Riceberry bran constituents by predicted binding to human maltase-glucoamylase (MGAM) and pancreatic α-amylase (HPA), alongside the solubility a food ingredient needs.</w:t>
       </w:r>
       <w:r>
         <w:rPr>
@@ -454,7 +454,7 @@
           <w:u w:val="none"/>
           <w:szCs w:val="22"/>
         </w:rPr>
-        <w:t>Re-docked acarbose reproduced its crystal pose (RMSD 2.04–2.06 Å; −7.81 kcal/mol on MGAM, −8.69 on HPA). γ-Oryzanol esters bound most tightly (cycloartenyl ferulate −8.87 ± 0.12 on MGAM, −10.52 ± 0.09 on HPA) but were strongly lipophilic (logP &gt; 10). Cyanidin-3-O-glucoside (−7.71 ± 0.02; −8.09 ± 0.02) and peonidin-3-O-glucoside (−7.64; −8.09) ranked next, hydrogen-bonded the catalytic acids of both enzymes (Asp443/Asp542 and Asp197/Glu233), and were the only high-ranking compounds that were water-soluble (logP &lt; 0.7).</w:t>
+        <w:t>Re-docked acarbose reproduced its crystal pose (RMSD 2.04–2.06 Å; −7.81 kcal/mol on MGAM, −8.69 on HPA). γ-Oryzanol esters bound most tightly (cycloartenyl ferulate −8.87 ± 0.12 on MGAM, −10.52 ± 0.09 on HPA) but were strongly lipophilic (logP &gt; 10). Cyanidin-3-O-glucoside (−7.71 ± 0.02; −8.09 ± 0.02) and peonidin-3-O-glucoside (−7.64; −8.09) ranked next, hydrogen-bonded the catalytic acids of both enzymes (Asp443/Asp542 and Asp197/Glu233), and were the only water-soluble front-runners (logP &lt; 0.7).</w:t>
       </w:r>
       <w:r>
         <w:rPr>

</xml_diff>

<commit_message>
Rebalance the poster layout and clear the abstract title from the template banner
- poster: Fig. 1 fills the left column with a takeaway panel under it, the
  findings panel carries the size-bias result, and no block overlaps or leaves
  the template's content card
- abstract: two spacer lines so the title clears the banner by 1.15 cm
- the lab plan and lab-access letter stay out of this repo (personal contact details)

Co-Authored-By: Claude Opus 5 <noreply@anthropic.com>
</commit_message>
<xml_diff>
--- a/submission/Abstract_Puttitada_Pruetchayakul.docx
+++ b/submission/Abstract_Puttitada_Pruetchayakul.docx
@@ -4,6 +4,38 @@
   <w:body>
     <w:p>
       <w:pPr>
+        <w:spacing w:after="0" w:before="0"/>
+        <w:jc w:val="center"/>
+      </w:pPr>
+      <w:r>
+        <w:rPr>
+          <w:rFonts w:ascii="TH Sarabun New" w:hAnsi="TH Sarabun New" w:cs="TH Sarabun New" w:eastAsia="TH Sarabun New"/>
+          <w:b w:val="0"/>
+          <w:i w:val="0"/>
+          <w:sz w:val="32"/>
+          <w:u w:val="none"/>
+          <w:szCs w:val="32"/>
+        </w:rPr>
+      </w:r>
+    </w:p>
+    <w:p>
+      <w:pPr>
+        <w:spacing w:after="0" w:before="0"/>
+        <w:jc w:val="center"/>
+      </w:pPr>
+      <w:r>
+        <w:rPr>
+          <w:rFonts w:ascii="TH Sarabun New" w:hAnsi="TH Sarabun New" w:cs="TH Sarabun New" w:eastAsia="TH Sarabun New"/>
+          <w:b w:val="0"/>
+          <w:i w:val="0"/>
+          <w:sz w:val="32"/>
+          <w:u w:val="none"/>
+          <w:szCs w:val="32"/>
+        </w:rPr>
+      </w:r>
+    </w:p>
+    <w:p>
+      <w:pPr>
         <w:spacing w:after="160" w:before="0"/>
         <w:jc w:val="center"/>
       </w:pPr>
@@ -280,6 +312,38 @@
     <w:p>
       <w:r>
         <w:br w:type="page"/>
+      </w:r>
+    </w:p>
+    <w:p>
+      <w:pPr>
+        <w:spacing w:after="0" w:before="0"/>
+        <w:jc w:val="center"/>
+      </w:pPr>
+      <w:r>
+        <w:rPr>
+          <w:rFonts w:ascii="Arial" w:hAnsi="Arial" w:cs="Arial" w:eastAsia="Arial"/>
+          <w:b w:val="0"/>
+          <w:i w:val="0"/>
+          <w:sz w:val="32"/>
+          <w:u w:val="none"/>
+          <w:szCs w:val="32"/>
+        </w:rPr>
+      </w:r>
+    </w:p>
+    <w:p>
+      <w:pPr>
+        <w:spacing w:after="0" w:before="0"/>
+        <w:jc w:val="center"/>
+      </w:pPr>
+      <w:r>
+        <w:rPr>
+          <w:rFonts w:ascii="Arial" w:hAnsi="Arial" w:cs="Arial" w:eastAsia="Arial"/>
+          <w:b w:val="0"/>
+          <w:i w:val="0"/>
+          <w:sz w:val="32"/>
+          <w:u w:val="none"/>
+          <w:szCs w:val="32"/>
+        </w:rPr>
       </w:r>
     </w:p>
     <w:p>

</xml_diff>